<commit_message>
Update published resume with latest edits
Co-Authored-By: Claude Sonnet 5 <noreply@anthropic.com>
</commit_message>
<xml_diff>
--- a/assets/resume/Kartike Chaurasia Resume.docx
+++ b/assets/resume/Kartike Chaurasia Resume.docx
@@ -177,7 +177,19 @@
     </w:p>
     <w:p>
       <w:pPr>
-        <w:spacing w:before="100" w:line="240" w:lineRule="auto"/>
+        <w:tabs>
+          <w:tab w:val="right" w:pos="10800"/>
+        </w:tabs>
+        <w:spacing w:before="40" w:line="240" w:lineRule="auto"/>
+        <w:rPr>
+          <w:rFonts w:ascii="Calibri" w:eastAsia="Calibri" w:hAnsi="Calibri" w:cs="Calibri"/>
+          <w:b/>
+          <w:i/>
+          <w:sz w:val="20"/>
+          <w:szCs w:val="20"/>
+        </w:rPr>
+      </w:pPr>
+      <w:r>
         <w:rPr>
           <w:rFonts w:ascii="Calibri" w:eastAsia="Calibri" w:hAnsi="Calibri" w:cs="Calibri"/>
           <w:b/>
@@ -186,7 +198,8 @@
           <w:szCs w:val="24"/>
           <w:u w:val="single"/>
         </w:rPr>
-      </w:pPr>
+        <w:t>WORK EXPERIENCE</w:t>
+      </w:r>
       <w:r>
         <w:rPr>
           <w:rFonts w:ascii="Calibri" w:eastAsia="Calibri" w:hAnsi="Calibri" w:cs="Calibri"/>
@@ -196,15 +209,9 @@
           <w:szCs w:val="24"/>
           <w:u w:val="single"/>
         </w:rPr>
-        <w:t>WORK EXPERIENCE</w:t>
-      </w:r>
-    </w:p>
-    <w:p>
-      <w:pPr>
-        <w:tabs>
-          <w:tab w:val="right" w:pos="10800"/>
-        </w:tabs>
-        <w:spacing w:before="40" w:line="240" w:lineRule="auto"/>
+        <w:br/>
+      </w:r>
+      <w:r>
         <w:rPr>
           <w:rFonts w:ascii="Calibri" w:eastAsia="Calibri" w:hAnsi="Calibri" w:cs="Calibri"/>
           <w:b/>
@@ -212,7 +219,26 @@
           <w:sz w:val="20"/>
           <w:szCs w:val="20"/>
         </w:rPr>
-      </w:pPr>
+        <w:t xml:space="preserve">Site Reliability Engineer II, </w:t>
+      </w:r>
+      <w:r>
+        <w:rPr>
+          <w:rFonts w:ascii="Calibri" w:eastAsia="Calibri" w:hAnsi="Calibri" w:cs="Calibri"/>
+          <w:i/>
+          <w:sz w:val="20"/>
+          <w:szCs w:val="20"/>
+        </w:rPr>
+        <w:t>Coinbase</w:t>
+      </w:r>
+      <w:r>
+        <w:rPr>
+          <w:rFonts w:ascii="Calibri" w:eastAsia="Calibri" w:hAnsi="Calibri" w:cs="Calibri"/>
+          <w:i/>
+          <w:sz w:val="20"/>
+          <w:szCs w:val="20"/>
+        </w:rPr>
+        <w:tab/>
+      </w:r>
       <w:r>
         <w:rPr>
           <w:rFonts w:ascii="Calibri" w:eastAsia="Calibri" w:hAnsi="Calibri" w:cs="Calibri"/>
@@ -221,35 +247,7 @@
           <w:sz w:val="20"/>
           <w:szCs w:val="20"/>
         </w:rPr>
-        <w:t xml:space="preserve">Site Reliability Engineer II – Identity and Access Management, </w:t>
-      </w:r>
-      <w:r>
-        <w:rPr>
-          <w:rFonts w:ascii="Calibri" w:eastAsia="Calibri" w:hAnsi="Calibri" w:cs="Calibri"/>
-          <w:i/>
-          <w:sz w:val="20"/>
-          <w:szCs w:val="20"/>
-        </w:rPr>
-        <w:t>Coinbase</w:t>
-      </w:r>
-      <w:r>
-        <w:rPr>
-          <w:rFonts w:ascii="Calibri" w:eastAsia="Calibri" w:hAnsi="Calibri" w:cs="Calibri"/>
-          <w:i/>
-          <w:sz w:val="20"/>
-          <w:szCs w:val="20"/>
-        </w:rPr>
-        <w:tab/>
-      </w:r>
-      <w:r>
-        <w:rPr>
-          <w:rFonts w:ascii="Calibri" w:eastAsia="Calibri" w:hAnsi="Calibri" w:cs="Calibri"/>
-          <w:b/>
-          <w:i/>
-          <w:sz w:val="20"/>
-          <w:szCs w:val="20"/>
-        </w:rPr>
-        <w:t>September 2024 – Present</w:t>
+        <w:t>August 2026 – Present</w:t>
       </w:r>
     </w:p>
     <w:p>
@@ -281,29 +279,7 @@
           <w:szCs w:val="20"/>
           <w:lang w:val="en-US"/>
         </w:rPr>
-        <w:t>Modernized</w:t>
-      </w:r>
-      <w:r>
-        <w:rPr>
-          <w:rFonts w:ascii="Calibri" w:eastAsia="Calibri" w:hAnsi="Calibri" w:cs="Calibri"/>
-          <w:bCs/>
-          <w:iCs/>
-          <w:sz w:val="20"/>
-          <w:szCs w:val="20"/>
-          <w:lang w:val="en-US"/>
-        </w:rPr>
-        <w:t xml:space="preserve"> </w:t>
-      </w:r>
-      <w:r>
-        <w:rPr>
-          <w:rFonts w:ascii="Calibri" w:eastAsia="Calibri" w:hAnsi="Calibri" w:cs="Calibri"/>
-          <w:bCs/>
-          <w:iCs/>
-          <w:sz w:val="20"/>
-          <w:szCs w:val="20"/>
-          <w:lang w:val="en-US"/>
-        </w:rPr>
-        <w:t>a scalable authorization platform replacing a legacy LDAP-based access control system, supporting 200M+ authorization checks/month and reducing access latency by up to 88x while maintaining operational continuity</w:t>
+        <w:t>Designed and implemented a fine-grained authorization framework enabling field-level access control via JWT-based authentication, enforcing least-privilege policies across APIs and establishing a new standard for granular authorization within Coinbase services</w:t>
       </w:r>
     </w:p>
     <w:p>
@@ -335,7 +311,7 @@
           <w:szCs w:val="20"/>
           <w:lang w:val="en-US"/>
         </w:rPr>
-        <w:t>Upgraded a critical identity service from Tier-3 to Tier-1 by meeting 99.99% uptime and P99 latency &lt;150ms targets through smoke tests, failover drills, and production-readiness validation</w:t>
+        <w:t>Modernized</w:t>
       </w:r>
       <w:r>
         <w:rPr>
@@ -346,7 +322,7 @@
           <w:szCs w:val="20"/>
           <w:lang w:val="en-US"/>
         </w:rPr>
-        <w:t xml:space="preserve"> by increasing</w:t>
+        <w:t xml:space="preserve"> </w:t>
       </w:r>
       <w:r>
         <w:rPr>
@@ -357,18 +333,7 @@
           <w:szCs w:val="20"/>
           <w:lang w:val="en-US"/>
         </w:rPr>
-        <w:t xml:space="preserve"> test coverage from 5% to 90</w:t>
-      </w:r>
-      <w:r>
-        <w:rPr>
-          <w:rFonts w:ascii="Calibri" w:eastAsia="Calibri" w:hAnsi="Calibri" w:cs="Calibri"/>
-          <w:bCs/>
-          <w:iCs/>
-          <w:sz w:val="20"/>
-          <w:szCs w:val="20"/>
-          <w:lang w:val="en-US"/>
-        </w:rPr>
-        <w:t>%</w:t>
+        <w:t>a scalable authorization platform replacing a legacy LDAP-based access control system, supporting 200M+ authorization checks/month and reducing access latency by up to 88x while maintaining operational continuity</w:t>
       </w:r>
     </w:p>
     <w:p>
@@ -400,7 +365,40 @@
           <w:szCs w:val="20"/>
           <w:lang w:val="en-US"/>
         </w:rPr>
-        <w:t>Automated self-healing and health monitoring workflows, preventing 7+ high-severity incidents and saving 40+ on-call engineering hours annually</w:t>
+        <w:t>Upgraded a critical identity service from Tier-3 to Tier-1 by meeting 99.99% uptime and P99 latency &lt;150ms targets through smoke tests, failover drills, and production-readiness validation</w:t>
+      </w:r>
+      <w:r>
+        <w:rPr>
+          <w:rFonts w:ascii="Calibri" w:eastAsia="Calibri" w:hAnsi="Calibri" w:cs="Calibri"/>
+          <w:bCs/>
+          <w:iCs/>
+          <w:sz w:val="20"/>
+          <w:szCs w:val="20"/>
+          <w:lang w:val="en-US"/>
+        </w:rPr>
+        <w:t xml:space="preserve"> by increasing</w:t>
+      </w:r>
+      <w:r>
+        <w:rPr>
+          <w:rFonts w:ascii="Calibri" w:eastAsia="Calibri" w:hAnsi="Calibri" w:cs="Calibri"/>
+          <w:bCs/>
+          <w:iCs/>
+          <w:sz w:val="20"/>
+          <w:szCs w:val="20"/>
+          <w:lang w:val="en-US"/>
+        </w:rPr>
+        <w:t xml:space="preserve"> test coverage from 5% to 90</w:t>
+      </w:r>
+      <w:r>
+        <w:rPr>
+          <w:rFonts w:ascii="Calibri" w:eastAsia="Calibri" w:hAnsi="Calibri" w:cs="Calibri"/>
+          <w:bCs/>
+          <w:iCs/>
+          <w:sz w:val="20"/>
+          <w:szCs w:val="20"/>
+          <w:lang w:val="en-US"/>
+        </w:rPr>
+        <w:t>%</w:t>
       </w:r>
     </w:p>
     <w:p>
@@ -432,7 +430,7 @@
           <w:szCs w:val="20"/>
           <w:lang w:val="en-US"/>
         </w:rPr>
-        <w:t>Diagnosed failing production health checks by tracing logs, service probes, and configuration behavior, restoring correct restart behavior and improving service resilience</w:t>
+        <w:t>Automated self-healing and health monitoring workflows, preventing 7+ high-severity incidents and saving 40+ on-call engineering hours annually</w:t>
       </w:r>
     </w:p>
     <w:p>
@@ -464,7 +462,70 @@
           <w:szCs w:val="20"/>
           <w:lang w:val="en-US"/>
         </w:rPr>
-        <w:t>Designed and implemented a fine-grained authorization framework enabling field-level access control via JWT-based authentication, enforcing least-privilege policies across APIs and establishing a new standard for granular authorization within Coinbase services</w:t>
+        <w:t>Developed a Model Context Protocol server for a unified data service aggregating identity and HR data from SaaS providers such as Okta and Workday, leveraging the SCIM-based API to simplify cross-system data queries</w:t>
+      </w:r>
+    </w:p>
+    <w:p>
+      <w:pPr>
+        <w:tabs>
+          <w:tab w:val="right" w:pos="10800"/>
+        </w:tabs>
+        <w:spacing w:before="40" w:line="240" w:lineRule="auto"/>
+        <w:rPr>
+          <w:rFonts w:ascii="Calibri" w:eastAsia="Calibri" w:hAnsi="Calibri" w:cs="Calibri"/>
+          <w:b/>
+          <w:i/>
+          <w:sz w:val="20"/>
+          <w:szCs w:val="20"/>
+        </w:rPr>
+      </w:pPr>
+      <w:r>
+        <w:rPr>
+          <w:rFonts w:ascii="Calibri" w:eastAsia="Calibri" w:hAnsi="Calibri" w:cs="Calibri"/>
+          <w:b/>
+          <w:i/>
+          <w:sz w:val="20"/>
+          <w:szCs w:val="20"/>
+        </w:rPr>
+        <w:t xml:space="preserve">Site Reliability Engineer, </w:t>
+      </w:r>
+      <w:r>
+        <w:rPr>
+          <w:rFonts w:ascii="Calibri" w:eastAsia="Calibri" w:hAnsi="Calibri" w:cs="Calibri"/>
+          <w:i/>
+          <w:sz w:val="20"/>
+          <w:szCs w:val="20"/>
+        </w:rPr>
+        <w:t>Coinbase</w:t>
+      </w:r>
+      <w:r>
+        <w:rPr>
+          <w:rFonts w:ascii="Calibri" w:eastAsia="Calibri" w:hAnsi="Calibri" w:cs="Calibri"/>
+          <w:i/>
+          <w:sz w:val="20"/>
+          <w:szCs w:val="20"/>
+        </w:rPr>
+        <w:tab/>
+      </w:r>
+      <w:r>
+        <w:rPr>
+          <w:rFonts w:ascii="Calibri" w:eastAsia="Calibri" w:hAnsi="Calibri" w:cs="Calibri"/>
+          <w:b/>
+          <w:i/>
+          <w:sz w:val="20"/>
+          <w:szCs w:val="20"/>
+        </w:rPr>
+        <w:t xml:space="preserve">September 2024 – </w:t>
+      </w:r>
+      <w:r>
+        <w:rPr>
+          <w:rFonts w:ascii="Calibri" w:eastAsia="Calibri" w:hAnsi="Calibri" w:cs="Calibri"/>
+          <w:b/>
+          <w:i/>
+          <w:sz w:val="20"/>
+          <w:szCs w:val="20"/>
+        </w:rPr>
+        <w:t>August 2026</w:t>
       </w:r>
     </w:p>
     <w:p>
@@ -496,29 +557,7 @@
           <w:szCs w:val="20"/>
           <w:lang w:val="en-US"/>
         </w:rPr>
-        <w:t>Established</w:t>
-      </w:r>
-      <w:r>
-        <w:rPr>
-          <w:rFonts w:ascii="Calibri" w:eastAsia="Calibri" w:hAnsi="Calibri" w:cs="Calibri"/>
-          <w:bCs/>
-          <w:iCs/>
-          <w:sz w:val="20"/>
-          <w:szCs w:val="20"/>
-          <w:lang w:val="en-US"/>
-        </w:rPr>
-        <w:t xml:space="preserve"> </w:t>
-      </w:r>
-      <w:r>
-        <w:rPr>
-          <w:rFonts w:ascii="Calibri" w:eastAsia="Calibri" w:hAnsi="Calibri" w:cs="Calibri"/>
-          <w:bCs/>
-          <w:iCs/>
-          <w:sz w:val="20"/>
-          <w:szCs w:val="20"/>
-          <w:lang w:val="en-US"/>
-        </w:rPr>
-        <w:t>a cross-IdP authentication bridge that enabled SSO applications to securely access backend services with full user-level permission enforcement, eliminating proxy-based workarounds that bypassed the authorization layer</w:t>
+        <w:t>Diagnosed failing production health checks by tracing logs, service probes, and configuration behavior, restoring correct restart behavior and improving service resilience</w:t>
       </w:r>
     </w:p>
     <w:p>
@@ -550,7 +589,7 @@
           <w:szCs w:val="20"/>
           <w:lang w:val="en-US"/>
         </w:rPr>
-        <w:t>Engineered</w:t>
+        <w:t>Established</w:t>
       </w:r>
       <w:r>
         <w:rPr>
@@ -572,7 +611,7 @@
           <w:szCs w:val="20"/>
           <w:lang w:val="en-US"/>
         </w:rPr>
-        <w:t>a new Golang ingestion and client framework, reducing onboarding time for new integrations from 2 months to 1 day, eliminating 2,000+ lines of redundant code, and improving maintainability</w:t>
+        <w:t>a cross-IdP authentication bridge that enabled SSO applications to securely access backend services with full user-level permission enforcement, eliminating proxy-based workarounds that bypassed the authorization layer</w:t>
       </w:r>
     </w:p>
     <w:p>
@@ -604,7 +643,7 @@
           <w:szCs w:val="20"/>
           <w:lang w:val="en-US"/>
         </w:rPr>
-        <w:t>Implemented and released</w:t>
+        <w:t>Engineered</w:t>
       </w:r>
       <w:r>
         <w:rPr>
@@ -615,7 +654,18 @@
           <w:szCs w:val="20"/>
           <w:lang w:val="en-US"/>
         </w:rPr>
-        <w:t xml:space="preserve"> a Kafka-backed real-time event stream for identity changes, enabling downstream services to consume field-level updates and migrate off a legacy event pipeline</w:t>
+        <w:t xml:space="preserve"> </w:t>
+      </w:r>
+      <w:r>
+        <w:rPr>
+          <w:rFonts w:ascii="Calibri" w:eastAsia="Calibri" w:hAnsi="Calibri" w:cs="Calibri"/>
+          <w:bCs/>
+          <w:iCs/>
+          <w:sz w:val="20"/>
+          <w:szCs w:val="20"/>
+          <w:lang w:val="en-US"/>
+        </w:rPr>
+        <w:t>a new Golang ingestion and client framework, reducing onboarding time for new integrations from 2 months to 1 day, eliminating 2,000+ lines of redundant code, and improving maintainability</w:t>
       </w:r>
     </w:p>
     <w:p>
@@ -647,7 +697,7 @@
           <w:szCs w:val="20"/>
           <w:lang w:val="en-US"/>
         </w:rPr>
-        <w:t>Developed</w:t>
+        <w:t>Implemented and released</w:t>
       </w:r>
       <w:r>
         <w:rPr>
@@ -658,18 +708,7 @@
           <w:szCs w:val="20"/>
           <w:lang w:val="en-US"/>
         </w:rPr>
-        <w:t xml:space="preserve"> </w:t>
-      </w:r>
-      <w:r>
-        <w:rPr>
-          <w:rFonts w:ascii="Calibri" w:eastAsia="Calibri" w:hAnsi="Calibri" w:cs="Calibri"/>
-          <w:bCs/>
-          <w:iCs/>
-          <w:sz w:val="20"/>
-          <w:szCs w:val="20"/>
-          <w:lang w:val="en-US"/>
-        </w:rPr>
-        <w:t>an AST-based SCIM filter parsing and query pipeline supporting complex nested queries and 50+ field mappings, enabling advanced identity search capabilities and vendor-agnostic integrations</w:t>
+        <w:t xml:space="preserve"> a Kafka-backed real-time event stream for identity changes, enabling downstream services to consume field-level updates and migrate off a legacy event pipeline</w:t>
       </w:r>
     </w:p>
     <w:p>
@@ -701,7 +740,29 @@
           <w:szCs w:val="20"/>
           <w:lang w:val="en-US"/>
         </w:rPr>
-        <w:t>Implemented wallet-based, cryptographically secure identity verification for self-service account and device unlocks, eliminating 650+ annual IT support tickets and reducing mean resolution time from hours to minutes</w:t>
+        <w:t>Developed</w:t>
+      </w:r>
+      <w:r>
+        <w:rPr>
+          <w:rFonts w:ascii="Calibri" w:eastAsia="Calibri" w:hAnsi="Calibri" w:cs="Calibri"/>
+          <w:bCs/>
+          <w:iCs/>
+          <w:sz w:val="20"/>
+          <w:szCs w:val="20"/>
+          <w:lang w:val="en-US"/>
+        </w:rPr>
+        <w:t xml:space="preserve"> </w:t>
+      </w:r>
+      <w:r>
+        <w:rPr>
+          <w:rFonts w:ascii="Calibri" w:eastAsia="Calibri" w:hAnsi="Calibri" w:cs="Calibri"/>
+          <w:bCs/>
+          <w:iCs/>
+          <w:sz w:val="20"/>
+          <w:szCs w:val="20"/>
+          <w:lang w:val="en-US"/>
+        </w:rPr>
+        <w:t>an AST-based SCIM filter parsing and query pipeline supporting complex nested queries and 50+ field mappings, enabling advanced identity search capabilities and vendor-agnostic integrations</w:t>
       </w:r>
     </w:p>
     <w:p>
@@ -733,7 +794,7 @@
           <w:szCs w:val="20"/>
           <w:lang w:val="en-US"/>
         </w:rPr>
-        <w:t>Architected secure identity lifecycle enforcement for wallet-based identity verification, automatically revoking and delinking wallets upon identity deactivation to prevent unauthorized access and reduce residual credential risk</w:t>
+        <w:t>Implemented wallet-based, cryptographically secure identity verification for self-service account and device unlocks, eliminating 650+ annual IT support tickets and reducing mean resolution time from hours to minutes</w:t>
       </w:r>
     </w:p>
     <w:p>
@@ -765,7 +826,7 @@
           <w:szCs w:val="20"/>
           <w:lang w:val="en-US"/>
         </w:rPr>
-        <w:t>Developed a Model Context Protocol server for a unified data service aggregating identity and HR data from SaaS providers such as Okta and Workday, leveraging the SCIM-based API to simplify cross-system data queries</w:t>
+        <w:t>Architected secure identity lifecycle enforcement for wallet-based identity verification, automatically revoking and delinking wallets upon identity deactivation to prevent unauthorized access and reduce residual credential risk</w:t>
       </w:r>
     </w:p>
     <w:p>
@@ -1471,32 +1532,6 @@
           <w:szCs w:val="20"/>
         </w:rPr>
         <w:t>j</w:t>
-      </w:r>
-      <w:r>
-        <w:rPr>
-          <w:rFonts w:ascii="Calibri" w:eastAsia="Calibri" w:hAnsi="Calibri" w:cs="Calibri"/>
-          <w:sz w:val="20"/>
-          <w:szCs w:val="20"/>
-        </w:rPr>
-        <w:br/>
-      </w:r>
-      <w:r>
-        <w:rPr>
-          <w:rFonts w:ascii="Calibri" w:eastAsia="Calibri" w:hAnsi="Calibri" w:cs="Calibri"/>
-          <w:b/>
-          <w:bCs/>
-          <w:sz w:val="20"/>
-          <w:szCs w:val="20"/>
-        </w:rPr>
-        <w:t>Testing &amp; Quality:</w:t>
-      </w:r>
-      <w:r>
-        <w:rPr>
-          <w:rFonts w:ascii="Calibri" w:eastAsia="Calibri" w:hAnsi="Calibri" w:cs="Calibri"/>
-          <w:sz w:val="20"/>
-          <w:szCs w:val="20"/>
-        </w:rPr>
-        <w:t xml:space="preserve"> Unit Testing, Integration Testing, Load/Performance Testing, Automated Smoke Tests</w:t>
       </w:r>
     </w:p>
     <w:p>
@@ -4316,6 +4351,7 @@
   <w:style w:type="paragraph" w:default="1" w:styleId="Normal">
     <w:name w:val="Normal"/>
     <w:qFormat/>
+    <w:rsid w:val="00D73A5A"/>
   </w:style>
   <w:style w:type="paragraph" w:styleId="Heading1">
     <w:name w:val="heading 1"/>

</xml_diff>